<commit_message>
feat(itrust-study): publish specification and test suite v3.0
</commit_message>
<xml_diff>
--- a/output/docx/UC1UserFunctionality.docx
+++ b/output/docx/UC1UserFunctionality.docx
@@ -39,7 +39,7 @@
           <w:sz w:val="30"/>
           <w:color w:val="1A365D"/>
         </w:rPr>
-        <w:t>Use Case: UC1 User Functionality (v2.0)</w:t>
+        <w:t>Use Case: UC1 User Functionality (v3.0)</w:t>
       </w:r>
     </w:p>
     <w:p>
@@ -197,7 +197,7 @@
               <w:rPr>
                 <w:sz w:val="18"/>
               </w:rPr>
-              <w:t>admin: An Admin enters a user name, a password, confirm password, the role, and if the user is enabled (or active) in the system. The Admin presses the button to add the user . The user name serves as the User's Medical ID (MID). The possible roles are: Patient Health Care Provider (HCP) Admin</w:t>
+              <w:t>admin: An Admin enters a user name, a password, confirm password, the role, and if the user is enabled (or active) in the system. The Admin presses the button to add the user . The user name serves as the User's Medical ID (MID). The possible roles are: Patient Health Care Provider (HCP) Admin Emergency Responder (ER) Lab Tech</w:t>
             </w:r>
           </w:p>
         </w:tc>
@@ -513,7 +513,7 @@
               <w:rPr>
                 <w:sz w:val="18"/>
               </w:rPr>
-              <w:t>admin: An Admin enters a user name, a password, confirm password, the role, and if the user is enabled (or active) in the system. The Admin presses the button to add the user . The user name serves as the User's Medical ID (MID). The possible roles are: Patient Health Care Provider (HCP) Admin</w:t>
+              <w:t>admin: An Admin enters a user name, a password, confirm password, the role, and if the user is enabled (or active) in the system. The Admin presses the button to add the user . The user name serves as the User's Medical ID (MID). The possible roles are: Patient Health Care Provider (HCP) Admin Emergency Responder (ER) Lab Tech</w:t>
             </w:r>
           </w:p>
         </w:tc>
@@ -671,7 +671,7 @@
               <w:rPr>
                 <w:sz w:val="18"/>
               </w:rPr>
-              <w:t>admin: An Admin enters a user name, a password, confirm password, the role, and if the user is enabled (or active) in the system. The Admin presses the button to add the user . The user name serves as the User's Medical ID (MID). The possible roles are: Patient Health Care Provider (HCP) Admin</w:t>
+              <w:t>admin: An Admin enters a user name, a password, confirm password, the role, and if the user is enabled (or active) in the system. The Admin presses the button to add the user . The user name serves as the User's Medical ID (MID). The possible roles are: Patient Health Care Provider (HCP) Admin Emergency Responder (ER) Lab Tech</w:t>
             </w:r>
           </w:p>
         </w:tc>

</xml_diff>

<commit_message>
feat(itrust-study): publish specification and test suite v4.0
</commit_message>
<xml_diff>
--- a/output/docx/UC1UserFunctionality.docx
+++ b/output/docx/UC1UserFunctionality.docx
@@ -39,7 +39,7 @@
           <w:sz w:val="30"/>
           <w:color w:val="1A365D"/>
         </w:rPr>
-        <w:t>Use Case: UC1 User Functionality (v3.0)</w:t>
+        <w:t>Use Case: UC1 User Functionality (v4.0)</w:t>
       </w:r>
     </w:p>
     <w:p>
@@ -197,7 +197,7 @@
               <w:rPr>
                 <w:sz w:val="18"/>
               </w:rPr>
-              <w:t>admin: An Admin enters a user name, a password, confirm password, the role, and if the user is enabled (or active) in the system. The Admin presses the button to add the user . The user name serves as the User's Medical ID (MID). The possible roles are: Patient Health Care Provider (HCP) Admin Emergency Responder (ER) Lab Tech</w:t>
+              <w:t>admin: An Admin enters a user name, a password, confirm password, the role, and if the user is enabled (or active) in the system. The Admin presses the button to add the user . The user name serves as the User's Medical ID (MID). The possible roles are: Patient Health Care Provider (HCP) Optometrist HCP Ophthalmologist HCP Admin Emergency Responder (ER) Lab Tech</w:t>
             </w:r>
           </w:p>
         </w:tc>
@@ -513,7 +513,7 @@
               <w:rPr>
                 <w:sz w:val="18"/>
               </w:rPr>
-              <w:t>admin: An Admin enters a user name, a password, confirm password, the role, and if the user is enabled (or active) in the system. The Admin presses the button to add the user . The user name serves as the User's Medical ID (MID). The possible roles are: Patient Health Care Provider (HCP) Admin Emergency Responder (ER) Lab Tech</w:t>
+              <w:t>admin: An Admin enters a user name, a password, confirm password, the role, and if the user is enabled (or active) in the system. The Admin presses the button to add the user . The user name serves as the User's Medical ID (MID). The possible roles are: Patient Health Care Provider (HCP) Optometrist HCP Ophthalmologist HCP Admin Emergency Responder (ER) Lab Tech</w:t>
             </w:r>
           </w:p>
         </w:tc>
@@ -671,7 +671,7 @@
               <w:rPr>
                 <w:sz w:val="18"/>
               </w:rPr>
-              <w:t>admin: An Admin enters a user name, a password, confirm password, the role, and if the user is enabled (or active) in the system. The Admin presses the button to add the user . The user name serves as the User's Medical ID (MID). The possible roles are: Patient Health Care Provider (HCP) Admin Emergency Responder (ER) Lab Tech</w:t>
+              <w:t>admin: An Admin enters a user name, a password, confirm password, the role, and if the user is enabled (or active) in the system. The Admin presses the button to add the user . The user name serves as the User's Medical ID (MID). The possible roles are: Patient Health Care Provider (HCP) Optometrist HCP Ophthalmologist HCP Admin Emergency Responder (ER) Lab Tech</w:t>
             </w:r>
           </w:p>
         </w:tc>

</xml_diff>